<commit_message>
Regenerate V9 docx with flowchart image
</commit_message>
<xml_diff>
--- a/Laporan_Analisis_Udang_MDS_V9.docx
+++ b/Laporan_Analisis_Udang_MDS_V9.docx
@@ -45,11 +45,39 @@
       </w:r>
     </w:p>
     <w:p>
-      <w:r/>
-    </w:p>
-    <w:p>
       <w:r>
-        <w:t>[Gagal meload gambar: c:/Users/user/Downloads/mds-multivariate tugas kelompok/output/00_flowchart_crispdm.png]</w:t>
+        <w:drawing>
+          <wp:inline xmlns:a="http://schemas.openxmlformats.org/drawingml/2006/main" xmlns:pic="http://schemas.openxmlformats.org/drawingml/2006/picture">
+            <wp:extent cx="5486400" cy="2797101"/>
+            <wp:docPr id="1" name="Picture 1"/>
+            <wp:cNvGraphicFramePr>
+              <a:graphicFrameLocks noChangeAspect="1"/>
+            </wp:cNvGraphicFramePr>
+            <a:graphic>
+              <a:graphicData uri="http://schemas.openxmlformats.org/drawingml/2006/picture">
+                <pic:pic>
+                  <pic:nvPicPr>
+                    <pic:cNvPr id="0" name="00_flowchart_crispdm.png"/>
+                    <pic:cNvPicPr/>
+                  </pic:nvPicPr>
+                  <pic:blipFill>
+                    <a:blip r:embed="rId9"/>
+                    <a:stretch>
+                      <a:fillRect/>
+                    </a:stretch>
+                  </pic:blipFill>
+                  <pic:spPr>
+                    <a:xfrm>
+                      <a:off x="0" y="0"/>
+                      <a:ext cx="5486400" cy="2797101"/>
+                    </a:xfrm>
+                    <a:prstGeom prst="rect"/>
+                  </pic:spPr>
+                </pic:pic>
+              </a:graphicData>
+            </a:graphic>
+          </wp:inline>
+        </w:drawing>
       </w:r>
     </w:p>
     <w:p>
@@ -75,7 +103,7 @@
         <w:drawing>
           <wp:inline xmlns:a="http://schemas.openxmlformats.org/drawingml/2006/main" xmlns:pic="http://schemas.openxmlformats.org/drawingml/2006/picture">
             <wp:extent cx="5486400" cy="3429000"/>
-            <wp:docPr id="1" name="Picture 1"/>
+            <wp:docPr id="2" name="Picture 2"/>
             <wp:cNvGraphicFramePr>
               <a:graphicFrameLocks noChangeAspect="1"/>
             </wp:cNvGraphicFramePr>
@@ -87,7 +115,7 @@
                     <pic:cNvPicPr/>
                   </pic:nvPicPr>
                   <pic:blipFill>
-                    <a:blip r:embed="rId9"/>
+                    <a:blip r:embed="rId10"/>
                     <a:stretch>
                       <a:fillRect/>
                     </a:stretch>
@@ -119,7 +147,7 @@
         <w:drawing>
           <wp:inline xmlns:a="http://schemas.openxmlformats.org/drawingml/2006/main" xmlns:pic="http://schemas.openxmlformats.org/drawingml/2006/picture">
             <wp:extent cx="5486400" cy="3291840"/>
-            <wp:docPr id="2" name="Picture 2"/>
+            <wp:docPr id="3" name="Picture 3"/>
             <wp:cNvGraphicFramePr>
               <a:graphicFrameLocks noChangeAspect="1"/>
             </wp:cNvGraphicFramePr>
@@ -131,7 +159,7 @@
                     <pic:cNvPicPr/>
                   </pic:nvPicPr>
                   <pic:blipFill>
-                    <a:blip r:embed="rId10"/>
+                    <a:blip r:embed="rId11"/>
                     <a:stretch>
                       <a:fillRect/>
                     </a:stretch>
@@ -557,7 +585,7 @@
         <w:drawing>
           <wp:inline xmlns:a="http://schemas.openxmlformats.org/drawingml/2006/main" xmlns:pic="http://schemas.openxmlformats.org/drawingml/2006/picture">
             <wp:extent cx="5486400" cy="4116309"/>
-            <wp:docPr id="3" name="Picture 3"/>
+            <wp:docPr id="4" name="Picture 4"/>
             <wp:cNvGraphicFramePr>
               <a:graphicFrameLocks noChangeAspect="1"/>
             </wp:cNvGraphicFramePr>
@@ -569,7 +597,7 @@
                     <pic:cNvPicPr/>
                   </pic:nvPicPr>
                   <pic:blipFill>
-                    <a:blip r:embed="rId11"/>
+                    <a:blip r:embed="rId12"/>
                     <a:stretch>
                       <a:fillRect/>
                     </a:stretch>

</xml_diff>